<commit_message>
Update Block 6: add Nano Banana + ChatGPT for cover images
Replaces DALL-E / Midjourney with practical, free-tier options:
- NotebookLM still owns the text generation
- Nano Banana (Gemini 2.5 Flash Image) via gemini.google.com or
  aistudio.google.com — fast, free, 4 variants per request
- ChatGPT (GPT-4o image gen) as a fallback when already in ChatGPT

Adds a second copy-ready prompt for cover images and a tip about
Cyrillic text on AI-generated images (always add titles in Canva).

Also adds scripts/build-guide-docx.cjs so the .docx can be regenerated
from the same source content.

Co-Authored-By: Claude Opus 4.7 (1M context) <noreply@anthropic.com>
</commit_message>
<xml_diff>
--- a/public/guide.docx
+++ b/public/guide.docx
@@ -176,7 +176,7 @@
       <w:pPr>
         <w:spacing w:after="360" w:before="160"/>
       </w:pPr>
-      <w:hyperlink w:history="1" r:id="rIdp6z2mntzgqlsqskf848eb">
+      <w:hyperlink w:history="1" r:id="rIdcas8jlkdyo6uqkcnu79ud">
         <w:r>
           <w:rPr>
             <w:b/>
@@ -267,7 +267,7 @@
         </w:rPr>
         <w:t xml:space="preserve">Инструмент: </w:t>
       </w:r>
-      <w:hyperlink w:history="1" r:id="rId5blnmuwqssijr8xx3stca">
+      <w:hyperlink w:history="1" r:id="rIdqxefmittgm0ccapwghjxq">
         <w:r>
           <w:rPr>
             <w:color w:val="1E9FE0"/>
@@ -829,7 +829,7 @@
         </w:rPr>
         <w:t xml:space="preserve">Инструмент: </w:t>
       </w:r>
-      <w:hyperlink w:history="1" r:id="rIdtzt_6z1m5iyp7qwbjqevj">
+      <w:hyperlink w:history="1" r:id="rIdctufjfsnivjjn27woo3fi">
         <w:r>
           <w:rPr>
             <w:color w:val="1E9FE0"/>
@@ -1363,7 +1363,7 @@
         </w:rPr>
         <w:t xml:space="preserve">Инструмент: </w:t>
       </w:r>
-      <w:hyperlink w:history="1" r:id="rIdjyrcgrkueiovyex0wkpon">
+      <w:hyperlink w:history="1" r:id="rIdqf9fqrr0zyftgxg9wicun">
         <w:r>
           <w:rPr>
             <w:color w:val="1E9FE0"/>
@@ -1869,7 +1869,7 @@
         </w:rPr>
         <w:t xml:space="preserve">Инструмент: </w:t>
       </w:r>
-      <w:hyperlink w:history="1" r:id="rIdc5wbf6uitao1do1mv8zi-">
+      <w:hyperlink w:history="1" r:id="rId_qkgvsdjl7yrmibxx0zb6">
         <w:r>
           <w:rPr>
             <w:color w:val="1E9FE0"/>
@@ -2406,7 +2406,7 @@
         </w:rPr>
         <w:t xml:space="preserve">Инструмент: </w:t>
       </w:r>
-      <w:hyperlink w:history="1" r:id="rIdwzgdptowaqb3fsjjcvllm">
+      <w:hyperlink w:history="1" r:id="rIdak5f4naoryh3auiy4eepd">
         <w:r>
           <w:rPr>
             <w:color w:val="1E9FE0"/>
@@ -2953,12 +2953,12 @@
           <w:sz w:val="32"/>
           <w:szCs w:val="32"/>
         </w:rPr>
-        <w:t xml:space="preserve">Контент для соцсетей в NotebookLM</w:t>
-      </w:r>
-    </w:p>
-    <w:p>
-      <w:pPr>
-        <w:spacing w:after="200"/>
+        <w:t xml:space="preserve">Контент для соцсетей: пост + обложка</w:t>
+      </w:r>
+    </w:p>
+    <w:p>
+      <w:pPr>
+        <w:spacing w:after="80"/>
       </w:pPr>
       <w:r>
         <w:rPr>
@@ -2968,7 +2968,7 @@
         </w:rPr>
         <w:t xml:space="preserve">Инструмент: </w:t>
       </w:r>
-      <w:hyperlink w:history="1" r:id="rId8c9nxiobol4du-gow_8gx">
+      <w:hyperlink w:history="1" r:id="rIdidoyvkwn33x3pwm7pqzmz">
         <w:r>
           <w:rPr>
             <w:color w:val="1E9FE0"/>
@@ -2976,7 +2976,69 @@
             <w:szCs w:val="22"/>
             <w:u w:val="single"/>
           </w:rPr>
-          <w:t xml:space="preserve">NotebookLM (Google) + ChatGPT</w:t>
+          <w:t xml:space="preserve">NotebookLM (Google)</w:t>
+        </w:r>
+      </w:hyperlink>
+    </w:p>
+    <w:p>
+      <w:pPr>
+        <w:spacing w:after="200"/>
+      </w:pPr>
+      <w:r>
+        <w:rPr>
+          <w:color w:val="6B7886"/>
+          <w:sz w:val="20"/>
+          <w:szCs w:val="20"/>
+        </w:rPr>
+        <w:t xml:space="preserve">+ </w:t>
+      </w:r>
+      <w:hyperlink w:history="1" r:id="rIddy78e57bofzbbat5l9--c">
+        <w:r>
+          <w:rPr>
+            <w:color w:val="1E9FE0"/>
+            <w:sz w:val="20"/>
+            <w:szCs w:val="20"/>
+            <w:u w:val="single"/>
+          </w:rPr>
+          <w:t xml:space="preserve">Nano Banana — gemini.google.com</w:t>
+        </w:r>
+      </w:hyperlink>
+      <w:r>
+        <w:rPr>
+          <w:color w:val="6B7886"/>
+          <w:sz w:val="20"/>
+          <w:szCs w:val="20"/>
+        </w:rPr>
+        <w:t xml:space="preserve">  ·  </w:t>
+      </w:r>
+      <w:hyperlink w:history="1" r:id="rIda4chvvum6drwy4-5gd-tm">
+        <w:r>
+          <w:rPr>
+            <w:color w:val="1E9FE0"/>
+            <w:sz w:val="20"/>
+            <w:szCs w:val="20"/>
+            <w:u w:val="single"/>
+          </w:rPr>
+          <w:t xml:space="preserve">Google AI Studio — aistudio.google.com</w:t>
+        </w:r>
+      </w:hyperlink>
+      <w:r>
+        <w:rPr>
+          <w:color w:val="6B7886"/>
+          <w:sz w:val="20"/>
+          <w:szCs w:val="20"/>
+        </w:rPr>
+        <w:t xml:space="preserve">  ·  </w:t>
+      </w:r>
+      <w:hyperlink w:history="1" r:id="rIdaouwwiex8lowyh-f49yl8">
+        <w:r>
+          <w:rPr>
+            <w:color w:val="1E9FE0"/>
+            <w:sz w:val="20"/>
+            <w:szCs w:val="20"/>
+            <w:u w:val="single"/>
+          </w:rPr>
+          <w:t xml:space="preserve">ChatGPT — chat.openai.com</w:t>
         </w:r>
       </w:hyperlink>
     </w:p>
@@ -3049,7 +3111,7 @@
                 <w:sz w:val="22"/>
                 <w:szCs w:val="22"/>
               </w:rPr>
-              <w:t xml:space="preserve">Из клинического кейса сделать пост в Instagram / Telegram-канал за 90 секунд.</w:t>
+              <w:t xml:space="preserve">Собрать готовый пост с обложкой за 90 секунд: текст в NotebookLM, картинка в Nano Banana или ChatGPT.</w:t>
             </w:r>
           </w:p>
         </w:tc>
@@ -3142,7 +3204,7 @@
           <w:sz w:val="22"/>
           <w:szCs w:val="22"/>
         </w:rPr>
-        <w:t xml:space="preserve">В NotebookLM откройте блокнот по нозологии (например, «Анемии»).</w:t>
+        <w:t xml:space="preserve">Шаг 1 (текст). В NotebookLM откройте блокнот по нозологии (например, «Анемии») и используйте промпт «пост в соцсети» — получите текст на 1500 символов.</w:t>
       </w:r>
     </w:p>
     <w:p>
@@ -3159,7 +3221,7 @@
           <w:sz w:val="22"/>
           <w:szCs w:val="22"/>
         </w:rPr>
-        <w:t xml:space="preserve">Используйте промпт «контент для соцсетей» — он генерирует пост в нужном тоне.</w:t>
+        <w:t xml:space="preserve">Шаг 2 (адаптация). Скопируйте результат в ChatGPT и попросите переписать под формат вашей соцсети (Instagram, Telegram, Threads).</w:t>
       </w:r>
     </w:p>
     <w:p>
@@ -3176,7 +3238,7 @@
           <w:sz w:val="22"/>
           <w:szCs w:val="22"/>
         </w:rPr>
-        <w:t xml:space="preserve">Скопируйте результат в ChatGPT и попросите адаптировать под формат вашей соцсети (Instagram, Telegram, Threads).</w:t>
+        <w:t xml:space="preserve">Шаг 3a (обложка в Nano Banana). Откройте gemini.google.com или aistudio.google.com → выберите модель «Gemini 2.5 Flash Image» (это и есть Nano Banana). Вставьте промпт ниже и получите 4 варианта за 5 секунд. Бесплатно.</w:t>
       </w:r>
     </w:p>
     <w:p>
@@ -3193,7 +3255,7 @@
           <w:sz w:val="22"/>
           <w:szCs w:val="22"/>
         </w:rPr>
-        <w:t xml:space="preserve">Сгенерируйте 3 варианта обложки в DALL·E / Midjourney по описанию.</w:t>
+        <w:t xml:space="preserve">Шаг 3b (обложка в ChatGPT). На chat.openai.com (тариф Plus с GPT-4o) вставьте тот же промпт. Удобно, если уже работаете с ChatGPT — текст и картинка в одном чате.</w:t>
       </w:r>
     </w:p>
     <w:p>
@@ -3210,7 +3272,7 @@
           <w:sz w:val="22"/>
           <w:szCs w:val="22"/>
         </w:rPr>
-        <w:t xml:space="preserve">Опубликуйте — добавьте дисклеймер «Информация носит образовательный характер, не заменяет консультацию врача».</w:t>
+        <w:t xml:space="preserve">Опубликуйте лучший вариант — добавьте дисклеймер «Информация носит образовательный характер, не заменяет консультацию врача».</w:t>
       </w:r>
     </w:p>
     <w:p>
@@ -3266,7 +3328,7 @@
                 <w:sz w:val="18"/>
                 <w:szCs w:val="18"/>
               </w:rPr>
-              <w:t xml:space="preserve">ПРОМПТ ДЛЯ ПОСТА В СОЦСЕТИ</w:t>
+              <w:t xml:space="preserve">ПРОМПТ ДЛЯ ПОСТА (NOTEBOOKLM)</w:t>
             </w:r>
           </w:p>
           <w:p>
@@ -3365,6 +3427,191 @@
                 <w:szCs w:val="20"/>
               </w:rPr>
               <w:t xml:space="preserve">— В конце добавь хэштеги (5–7 штук) и дисклеймер.</w:t>
+            </w:r>
+          </w:p>
+        </w:tc>
+      </w:tr>
+    </w:tbl>
+    <w:p>
+      <w:pPr>
+        <w:spacing w:after="120"/>
+      </w:pPr>
+      <w:r>
+        <w:t xml:space="preserve"> </w:t>
+      </w:r>
+    </w:p>
+    <w:tbl>
+      <w:tblPr>
+        <w:tblW w:type="dxa" w:w="9360"/>
+        <w:tblBorders>
+          <w:top w:val="single" w:color="auto" w:sz="4"/>
+          <w:left w:val="single" w:color="auto" w:sz="4"/>
+          <w:bottom w:val="single" w:color="auto" w:sz="4"/>
+          <w:right w:val="single" w:color="auto" w:sz="4"/>
+          <w:insideH w:val="single" w:color="auto" w:sz="4"/>
+          <w:insideV w:val="single" w:color="auto" w:sz="4"/>
+        </w:tblBorders>
+      </w:tblPr>
+      <w:tblGrid>
+        <w:gridCol w:w="9360"/>
+      </w:tblGrid>
+      <w:tr>
+        <w:tc>
+          <w:tcPr>
+            <w:tcW w:type="dxa" w:w="9360"/>
+            <w:tcBorders>
+              <w:top w:val="single" w:color="1E9FE0" w:sz="4"/>
+              <w:left w:val="single" w:color="1E9FE0" w:sz="4"/>
+              <w:bottom w:val="single" w:color="1E9FE0" w:sz="4"/>
+              <w:right w:val="single" w:color="1E9FE0" w:sz="4"/>
+            </w:tcBorders>
+            <w:shd w:fill="F4F6F8" w:val="clear"/>
+            <w:tcMar>
+              <w:top w:type="dxa" w:w="200"/>
+              <w:left w:type="dxa" w:w="240"/>
+              <w:bottom w:type="dxa" w:w="200"/>
+              <w:right w:type="dxa" w:w="240"/>
+            </w:tcMar>
+          </w:tcPr>
+          <w:p>
+            <w:pPr>
+              <w:spacing w:after="120"/>
+            </w:pPr>
+            <w:r>
+              <w:rPr>
+                <w:b/>
+                <w:bCs/>
+                <w:color w:val="1E9FE0"/>
+                <w:sz w:val="18"/>
+                <w:szCs w:val="18"/>
+              </w:rPr>
+              <w:t xml:space="preserve">ПРОМПТ ДЛЯ ОБЛОЖКИ В NANO BANANA / CHATGPT</w:t>
+            </w:r>
+          </w:p>
+          <w:p>
+            <w:pPr>
+              <w:spacing w:after="40"/>
+            </w:pPr>
+            <w:r>
+              <w:rPr>
+                <w:rFonts w:ascii="Consolas" w:cs="Consolas" w:eastAsia="Consolas" w:hAnsi="Consolas"/>
+                <w:color w:val="1F2A37"/>
+                <w:sz w:val="20"/>
+                <w:szCs w:val="20"/>
+              </w:rPr>
+              <w:t xml:space="preserve">Минималистичная обложка для Instagram-поста врача на тему железодефицитной анемии у женщин.</w:t>
+            </w:r>
+          </w:p>
+          <w:p>
+            <w:pPr>
+              <w:spacing w:after="40"/>
+            </w:pPr>
+            <w:r>
+              <w:rPr>
+                <w:rFonts w:ascii="Consolas" w:cs="Consolas" w:eastAsia="Consolas" w:hAnsi="Consolas"/>
+                <w:color w:val="1F2A37"/>
+                <w:sz w:val="20"/>
+                <w:szCs w:val="20"/>
+              </w:rPr>
+              <w:t xml:space="preserve"> </w:t>
+            </w:r>
+          </w:p>
+          <w:p>
+            <w:pPr>
+              <w:spacing w:after="40"/>
+            </w:pPr>
+            <w:r>
+              <w:rPr>
+                <w:rFonts w:ascii="Consolas" w:cs="Consolas" w:eastAsia="Consolas" w:hAnsi="Consolas"/>
+                <w:color w:val="1F2A37"/>
+                <w:sz w:val="20"/>
+                <w:szCs w:val="20"/>
+              </w:rPr>
+              <w:t xml:space="preserve">Стиль: чистый, светлый, спокойный, без пугающих и медицинских клише (никаких пробирок, шприцев, окровавленных образов).</w:t>
+            </w:r>
+          </w:p>
+          <w:p>
+            <w:pPr>
+              <w:spacing w:after="40"/>
+            </w:pPr>
+            <w:r>
+              <w:rPr>
+                <w:rFonts w:ascii="Consolas" w:cs="Consolas" w:eastAsia="Consolas" w:hAnsi="Consolas"/>
+                <w:color w:val="1F2A37"/>
+                <w:sz w:val="20"/>
+                <w:szCs w:val="20"/>
+              </w:rPr>
+              <w:t xml:space="preserve"> </w:t>
+            </w:r>
+          </w:p>
+          <w:p>
+            <w:pPr>
+              <w:spacing w:after="40"/>
+            </w:pPr>
+            <w:r>
+              <w:rPr>
+                <w:rFonts w:ascii="Consolas" w:cs="Consolas" w:eastAsia="Consolas" w:hAnsi="Consolas"/>
+                <w:color w:val="1F2A37"/>
+                <w:sz w:val="20"/>
+                <w:szCs w:val="20"/>
+              </w:rPr>
+              <w:t xml:space="preserve">Композиция: на нейтральном пастельном фоне (мягкий бежевый, тёплый розовый или приглушённый шалфей) — стилизованная плоская иллюстрация в едином графическом стиле: лист шпината, половинка граната, кусочек красного мяса и одна капсула. Иконография — flat design, мягкие тени, тонкие линии.</w:t>
+            </w:r>
+          </w:p>
+          <w:p>
+            <w:pPr>
+              <w:spacing w:after="40"/>
+            </w:pPr>
+            <w:r>
+              <w:rPr>
+                <w:rFonts w:ascii="Consolas" w:cs="Consolas" w:eastAsia="Consolas" w:hAnsi="Consolas"/>
+                <w:color w:val="1F2A37"/>
+                <w:sz w:val="20"/>
+                <w:szCs w:val="20"/>
+              </w:rPr>
+              <w:t xml:space="preserve"> </w:t>
+            </w:r>
+          </w:p>
+          <w:p>
+            <w:pPr>
+              <w:spacing w:after="40"/>
+            </w:pPr>
+            <w:r>
+              <w:rPr>
+                <w:rFonts w:ascii="Consolas" w:cs="Consolas" w:eastAsia="Consolas" w:hAnsi="Consolas"/>
+                <w:color w:val="1F2A37"/>
+                <w:sz w:val="20"/>
+                <w:szCs w:val="20"/>
+              </w:rPr>
+              <w:t xml:space="preserve">В верхней трети — пустое место для заголовка (текст НЕ добавлять). Без надписей и логотипов на изображении.</w:t>
+            </w:r>
+          </w:p>
+          <w:p>
+            <w:pPr>
+              <w:spacing w:after="40"/>
+            </w:pPr>
+            <w:r>
+              <w:rPr>
+                <w:rFonts w:ascii="Consolas" w:cs="Consolas" w:eastAsia="Consolas" w:hAnsi="Consolas"/>
+                <w:color w:val="1F2A37"/>
+                <w:sz w:val="20"/>
+                <w:szCs w:val="20"/>
+              </w:rPr>
+              <w:t xml:space="preserve"> </w:t>
+            </w:r>
+          </w:p>
+          <w:p>
+            <w:pPr>
+              <w:spacing w:after="40"/>
+            </w:pPr>
+            <w:r>
+              <w:rPr>
+                <w:rFonts w:ascii="Consolas" w:cs="Consolas" w:eastAsia="Consolas" w:hAnsi="Consolas"/>
+                <w:color w:val="1F2A37"/>
+                <w:sz w:val="20"/>
+                <w:szCs w:val="20"/>
+              </w:rPr>
+              <w:t xml:space="preserve">Формат: квадрат 1:1, разрешение под Instagram (1080×1080). Цветовая палитра тёплая, не более 4 оттенков.</w:t>
             </w:r>
           </w:p>
         </w:tc>
@@ -3428,7 +3675,7 @@
                 <w:sz w:val="22"/>
                 <w:szCs w:val="22"/>
               </w:rPr>
-              <w:t xml:space="preserve">AI-контент — ваш черновик, а не финальный текст. 30 секунд на редактуру под ваш голос превращают шаблонный пост в авторский.</w:t>
+              <w:t xml:space="preserve">Nano Banana бесплатна, быстрее и лучше держит фирменный стиль через несколько итераций. ChatGPT удобнее, если уже пишете там пост — всё в одном чате. Никогда не просите AI добавить русский текст на картинку: оба инструмента портят кириллицу. Заголовок добавляйте сами в Canva или Figma.</w:t>
             </w:r>
           </w:p>
         </w:tc>
@@ -3602,7 +3849,7 @@
       <w:pPr>
         <w:spacing w:after="240"/>
       </w:pPr>
-      <w:hyperlink w:history="1" r:id="rIdiog2ibyc7ppi403jdbmms">
+      <w:hyperlink w:history="1" r:id="rIdtsmihukxqrdmmyuourd-h">
         <w:r>
           <w:rPr>
             <w:b/>
@@ -4286,23 +4533,5 @@
       <w:szCs w:val="32"/>
     </w:rPr>
   </w:style>
-  <w:style w:type="paragraph" w:styleId="Heading3">
-    <w:name w:val="Heading 3"/>
-    <w:basedOn w:val="Normal"/>
-    <w:next w:val="Normal"/>
-    <w:qFormat/>
-    <w:pPr>
-      <w:spacing w:after="120" w:before="200"/>
-      <w:outlineLvl w:val="2"/>
-    </w:pPr>
-    <w:rPr>
-      <w:rFonts w:ascii="Calibri" w:cs="Calibri" w:eastAsia="Calibri" w:hAnsi="Calibri"/>
-      <w:b/>
-      <w:bCs/>
-      <w:color w:val="1E9FE0"/>
-      <w:sz w:val="26"/>
-      <w:szCs w:val="26"/>
-    </w:rPr>
-  </w:style>
 </w:styles>
 </file>
</xml_diff>